<commit_message>
bảo mật phân quyền
</commit_message>
<xml_diff>
--- a/PHÂN CHIA TASK DỰ ÁN.docx
+++ b/PHÂN CHIA TASK DỰ ÁN.docx
@@ -32,7 +32,7 @@
     <w:p>
       <w:r>
         <w:pict w14:anchorId="29F4F93A">
-          <v:rect id="_x0000_i1061" style="width:0;height:1.5pt" o:hralign="center" o:hrstd="t" o:hr="t" fillcolor="#a0a0a0" stroked="f"/>
+          <v:rect id="_x0000_i1025" style="width:0;height:1.5pt" o:hralign="center" o:hrstd="t" o:hr="t" fillcolor="#a0a0a0" stroked="f"/>
         </w:pict>
       </w:r>
     </w:p>
@@ -531,7 +531,7 @@
     <w:p>
       <w:r>
         <w:pict w14:anchorId="3609DD25">
-          <v:rect id="_x0000_i1062" style="width:0;height:1.5pt" o:hralign="center" o:hrstd="t" o:hr="t" fillcolor="#a0a0a0" stroked="f"/>
+          <v:rect id="_x0000_i1026" style="width:0;height:1.5pt" o:hralign="center" o:hrstd="t" o:hr="t" fillcolor="#a0a0a0" stroked="f"/>
         </w:pict>
       </w:r>
     </w:p>
@@ -714,7 +714,7 @@
     <w:p>
       <w:r>
         <w:pict w14:anchorId="33759B53">
-          <v:rect id="_x0000_i1063" style="width:0;height:1.5pt" o:hralign="center" o:hrstd="t" o:hr="t" fillcolor="#a0a0a0" stroked="f"/>
+          <v:rect id="_x0000_i1027" style="width:0;height:1.5pt" o:hralign="center" o:hrstd="t" o:hr="t" fillcolor="#a0a0a0" stroked="f"/>
         </w:pict>
       </w:r>
     </w:p>
@@ -867,7 +867,7 @@
     <w:p>
       <w:r>
         <w:pict w14:anchorId="41D4928C">
-          <v:rect id="_x0000_i1064" style="width:0;height:1.5pt" o:hralign="center" o:hrstd="t" o:hr="t" fillcolor="#a0a0a0" stroked="f"/>
+          <v:rect id="_x0000_i1028" style="width:0;height:1.5pt" o:hralign="center" o:hrstd="t" o:hr="t" fillcolor="#a0a0a0" stroked="f"/>
         </w:pict>
       </w:r>
     </w:p>
@@ -1094,7 +1094,7 @@
     <w:p>
       <w:r>
         <w:pict w14:anchorId="1306E512">
-          <v:rect id="_x0000_i1065" style="width:0;height:1.5pt" o:hralign="center" o:hrstd="t" o:hr="t" fillcolor="#a0a0a0" stroked="f"/>
+          <v:rect id="_x0000_i1029" style="width:0;height:1.5pt" o:hralign="center" o:hrstd="t" o:hr="t" fillcolor="#a0a0a0" stroked="f"/>
         </w:pict>
       </w:r>
     </w:p>
@@ -1374,7 +1374,7 @@
     <w:p>
       <w:r>
         <w:pict w14:anchorId="0A8E9FB6">
-          <v:rect id="_x0000_i1066" style="width:0;height:1.5pt" o:hralign="center" o:hrstd="t" o:hr="t" fillcolor="#a0a0a0" stroked="f"/>
+          <v:rect id="_x0000_i1030" style="width:0;height:1.5pt" o:hralign="center" o:hrstd="t" o:hr="t" fillcolor="#a0a0a0" stroked="f"/>
         </w:pict>
       </w:r>
     </w:p>
@@ -1464,6 +1464,1315 @@
       </w:r>
       <w:r>
         <w:t xml:space="preserve"> Test tích hợp, sửa lỗi, viết SQL script dữ liệu mẫu, chuẩn bị deploy + slide thuyết trình</w:t>
+      </w:r>
+    </w:p>
+    <w:p>
+      <w:pPr>
+        <w:numPr>
+          <w:ilvl w:val="0"/>
+          <w:numId w:val="8"/>
+        </w:numPr>
+      </w:pPr>
+    </w:p>
+    <w:p>
+      <w:pPr>
+        <w:pStyle w:val="ListParagraph"/>
+        <w:numPr>
+          <w:ilvl w:val="0"/>
+          <w:numId w:val="8"/>
+        </w:numPr>
+        <w:shd w:val="clear" w:color="auto" w:fill="121314"/>
+        <w:spacing w:after="0" w:line="285" w:lineRule="atLeast"/>
+        <w:rPr>
+          <w:rFonts w:ascii="Consolas" w:eastAsia="Times New Roman" w:hAnsi="Consolas" w:cs="Times New Roman"/>
+          <w:color w:val="BBBEBF"/>
+          <w:kern w:val="0"/>
+          <w:sz w:val="21"/>
+          <w:szCs w:val="21"/>
+          <w14:ligatures w14:val="none"/>
+        </w:rPr>
+      </w:pPr>
+      <w:r>
+        <w:rPr>
+          <w:rFonts w:ascii="Consolas" w:eastAsia="Times New Roman" w:hAnsi="Consolas" w:cs="Times New Roman"/>
+          <w:color w:val="8B949E"/>
+          <w:kern w:val="0"/>
+          <w:sz w:val="21"/>
+          <w:szCs w:val="21"/>
+          <w14:ligatures w14:val="none"/>
+        </w:rPr>
+        <w:t># ==========================================================</w:t>
+      </w:r>
+    </w:p>
+    <w:p>
+      <w:pPr>
+        <w:pStyle w:val="ListParagraph"/>
+        <w:numPr>
+          <w:ilvl w:val="0"/>
+          <w:numId w:val="8"/>
+        </w:numPr>
+        <w:shd w:val="clear" w:color="auto" w:fill="121314"/>
+        <w:spacing w:after="0" w:line="285" w:lineRule="atLeast"/>
+        <w:rPr>
+          <w:rFonts w:ascii="Consolas" w:eastAsia="Times New Roman" w:hAnsi="Consolas" w:cs="Times New Roman"/>
+          <w:color w:val="BBBEBF"/>
+          <w:kern w:val="0"/>
+          <w:sz w:val="21"/>
+          <w:szCs w:val="21"/>
+          <w14:ligatures w14:val="none"/>
+        </w:rPr>
+      </w:pPr>
+      <w:r>
+        <w:rPr>
+          <w:rFonts w:ascii="Consolas" w:eastAsia="Times New Roman" w:hAnsi="Consolas" w:cs="Times New Roman"/>
+          <w:color w:val="8B949E"/>
+          <w:kern w:val="0"/>
+          <w:sz w:val="21"/>
+          <w:szCs w:val="21"/>
+          <w14:ligatures w14:val="none"/>
+        </w:rPr>
+        <w:t># CẤU HÌNH BIẾN MÔI TRƯỜNG (.env) - SHOPTECH</w:t>
+      </w:r>
+    </w:p>
+    <w:p>
+      <w:pPr>
+        <w:pStyle w:val="ListParagraph"/>
+        <w:numPr>
+          <w:ilvl w:val="0"/>
+          <w:numId w:val="8"/>
+        </w:numPr>
+        <w:shd w:val="clear" w:color="auto" w:fill="121314"/>
+        <w:spacing w:after="0" w:line="285" w:lineRule="atLeast"/>
+        <w:rPr>
+          <w:rFonts w:ascii="Consolas" w:eastAsia="Times New Roman" w:hAnsi="Consolas" w:cs="Times New Roman"/>
+          <w:color w:val="BBBEBF"/>
+          <w:kern w:val="0"/>
+          <w:sz w:val="21"/>
+          <w:szCs w:val="21"/>
+          <w14:ligatures w14:val="none"/>
+        </w:rPr>
+      </w:pPr>
+      <w:r>
+        <w:rPr>
+          <w:rFonts w:ascii="Consolas" w:eastAsia="Times New Roman" w:hAnsi="Consolas" w:cs="Times New Roman"/>
+          <w:color w:val="8B949E"/>
+          <w:kern w:val="0"/>
+          <w:sz w:val="21"/>
+          <w:szCs w:val="21"/>
+          <w14:ligatures w14:val="none"/>
+        </w:rPr>
+        <w:t># ==========================================================</w:t>
+      </w:r>
+    </w:p>
+    <w:p>
+      <w:pPr>
+        <w:pStyle w:val="ListParagraph"/>
+        <w:numPr>
+          <w:ilvl w:val="0"/>
+          <w:numId w:val="8"/>
+        </w:numPr>
+        <w:shd w:val="clear" w:color="auto" w:fill="121314"/>
+        <w:spacing w:after="0" w:line="285" w:lineRule="atLeast"/>
+        <w:rPr>
+          <w:rFonts w:ascii="Consolas" w:eastAsia="Times New Roman" w:hAnsi="Consolas" w:cs="Times New Roman"/>
+          <w:color w:val="BBBEBF"/>
+          <w:kern w:val="0"/>
+          <w:sz w:val="21"/>
+          <w:szCs w:val="21"/>
+          <w14:ligatures w14:val="none"/>
+        </w:rPr>
+      </w:pPr>
+    </w:p>
+    <w:p>
+      <w:pPr>
+        <w:pStyle w:val="ListParagraph"/>
+        <w:numPr>
+          <w:ilvl w:val="0"/>
+          <w:numId w:val="8"/>
+        </w:numPr>
+        <w:shd w:val="clear" w:color="auto" w:fill="121314"/>
+        <w:spacing w:after="0" w:line="285" w:lineRule="atLeast"/>
+        <w:rPr>
+          <w:rFonts w:ascii="Consolas" w:eastAsia="Times New Roman" w:hAnsi="Consolas" w:cs="Times New Roman"/>
+          <w:color w:val="BBBEBF"/>
+          <w:kern w:val="0"/>
+          <w:sz w:val="21"/>
+          <w:szCs w:val="21"/>
+          <w14:ligatures w14:val="none"/>
+        </w:rPr>
+      </w:pPr>
+      <w:r>
+        <w:rPr>
+          <w:rFonts w:ascii="Consolas" w:eastAsia="Times New Roman" w:hAnsi="Consolas" w:cs="Times New Roman"/>
+          <w:color w:val="8B949E"/>
+          <w:kern w:val="0"/>
+          <w:sz w:val="21"/>
+          <w:szCs w:val="21"/>
+          <w14:ligatures w14:val="none"/>
+        </w:rPr>
+        <w:t># 1. Supabase Database Configuration</w:t>
+      </w:r>
+    </w:p>
+    <w:p>
+      <w:pPr>
+        <w:pStyle w:val="ListParagraph"/>
+        <w:numPr>
+          <w:ilvl w:val="0"/>
+          <w:numId w:val="8"/>
+        </w:numPr>
+        <w:shd w:val="clear" w:color="auto" w:fill="121314"/>
+        <w:spacing w:after="0" w:line="285" w:lineRule="atLeast"/>
+        <w:rPr>
+          <w:rFonts w:ascii="Consolas" w:eastAsia="Times New Roman" w:hAnsi="Consolas" w:cs="Times New Roman"/>
+          <w:color w:val="BBBEBF"/>
+          <w:kern w:val="0"/>
+          <w:sz w:val="21"/>
+          <w:szCs w:val="21"/>
+          <w14:ligatures w14:val="none"/>
+        </w:rPr>
+      </w:pPr>
+      <w:r>
+        <w:rPr>
+          <w:rFonts w:ascii="Consolas" w:eastAsia="Times New Roman" w:hAnsi="Consolas" w:cs="Times New Roman"/>
+          <w:color w:val="8B949E"/>
+          <w:kern w:val="0"/>
+          <w:sz w:val="21"/>
+          <w:szCs w:val="21"/>
+          <w14:ligatures w14:val="none"/>
+        </w:rPr>
+        <w:t># 1. Supabase Database Configuration</w:t>
+      </w:r>
+    </w:p>
+    <w:p>
+      <w:pPr>
+        <w:pStyle w:val="ListParagraph"/>
+        <w:numPr>
+          <w:ilvl w:val="0"/>
+          <w:numId w:val="8"/>
+        </w:numPr>
+        <w:shd w:val="clear" w:color="auto" w:fill="121314"/>
+        <w:spacing w:after="0" w:line="285" w:lineRule="atLeast"/>
+        <w:rPr>
+          <w:rFonts w:ascii="Consolas" w:eastAsia="Times New Roman" w:hAnsi="Consolas" w:cs="Times New Roman"/>
+          <w:color w:val="BBBEBF"/>
+          <w:kern w:val="0"/>
+          <w:sz w:val="21"/>
+          <w:szCs w:val="21"/>
+          <w14:ligatures w14:val="none"/>
+        </w:rPr>
+      </w:pPr>
+      <w:r>
+        <w:rPr>
+          <w:rFonts w:ascii="Consolas" w:eastAsia="Times New Roman" w:hAnsi="Consolas" w:cs="Times New Roman"/>
+          <w:color w:val="FFA657"/>
+          <w:kern w:val="0"/>
+          <w:sz w:val="21"/>
+          <w:szCs w:val="21"/>
+          <w14:ligatures w14:val="none"/>
+        </w:rPr>
+        <w:t>SPRING_DATASOURCE_URL</w:t>
+      </w:r>
+      <w:r>
+        <w:rPr>
+          <w:rFonts w:ascii="Consolas" w:eastAsia="Times New Roman" w:hAnsi="Consolas" w:cs="Times New Roman"/>
+          <w:color w:val="D4D4D4"/>
+          <w:kern w:val="0"/>
+          <w:sz w:val="21"/>
+          <w:szCs w:val="21"/>
+          <w14:ligatures w14:val="none"/>
+        </w:rPr>
+        <w:t>=</w:t>
+      </w:r>
+      <w:r>
+        <w:rPr>
+          <w:rFonts w:ascii="Consolas" w:eastAsia="Times New Roman" w:hAnsi="Consolas" w:cs="Times New Roman"/>
+          <w:color w:val="BBBEBF"/>
+          <w:kern w:val="0"/>
+          <w:sz w:val="21"/>
+          <w:szCs w:val="21"/>
+          <w14:ligatures w14:val="none"/>
+        </w:rPr>
+        <w:t>jdbc:postgresql://aws-0-ap-southeast-1.pooler.supabase.com:6543/postgres?sslmode=require</w:t>
+      </w:r>
+    </w:p>
+    <w:p>
+      <w:pPr>
+        <w:pStyle w:val="ListParagraph"/>
+        <w:numPr>
+          <w:ilvl w:val="0"/>
+          <w:numId w:val="8"/>
+        </w:numPr>
+        <w:shd w:val="clear" w:color="auto" w:fill="121314"/>
+        <w:spacing w:after="0" w:line="285" w:lineRule="atLeast"/>
+        <w:rPr>
+          <w:rFonts w:ascii="Consolas" w:eastAsia="Times New Roman" w:hAnsi="Consolas" w:cs="Times New Roman"/>
+          <w:color w:val="BBBEBF"/>
+          <w:kern w:val="0"/>
+          <w:sz w:val="21"/>
+          <w:szCs w:val="21"/>
+          <w14:ligatures w14:val="none"/>
+        </w:rPr>
+      </w:pPr>
+      <w:r>
+        <w:rPr>
+          <w:rFonts w:ascii="Consolas" w:eastAsia="Times New Roman" w:hAnsi="Consolas" w:cs="Times New Roman"/>
+          <w:color w:val="FFA657"/>
+          <w:kern w:val="0"/>
+          <w:sz w:val="21"/>
+          <w:szCs w:val="21"/>
+          <w14:ligatures w14:val="none"/>
+        </w:rPr>
+        <w:t>SPRING_DATASOURCE_USERNAME</w:t>
+      </w:r>
+      <w:r>
+        <w:rPr>
+          <w:rFonts w:ascii="Consolas" w:eastAsia="Times New Roman" w:hAnsi="Consolas" w:cs="Times New Roman"/>
+          <w:color w:val="D4D4D4"/>
+          <w:kern w:val="0"/>
+          <w:sz w:val="21"/>
+          <w:szCs w:val="21"/>
+          <w14:ligatures w14:val="none"/>
+        </w:rPr>
+        <w:t>=</w:t>
+      </w:r>
+      <w:r>
+        <w:rPr>
+          <w:rFonts w:ascii="Consolas" w:eastAsia="Times New Roman" w:hAnsi="Consolas" w:cs="Times New Roman"/>
+          <w:color w:val="BBBEBF"/>
+          <w:kern w:val="0"/>
+          <w:sz w:val="21"/>
+          <w:szCs w:val="21"/>
+          <w14:ligatures w14:val="none"/>
+        </w:rPr>
+        <w:t>postgres.dztrhopimqfdurmgzlpx</w:t>
+      </w:r>
+    </w:p>
+    <w:p>
+      <w:pPr>
+        <w:pStyle w:val="ListParagraph"/>
+        <w:numPr>
+          <w:ilvl w:val="0"/>
+          <w:numId w:val="8"/>
+        </w:numPr>
+        <w:shd w:val="clear" w:color="auto" w:fill="121314"/>
+        <w:spacing w:after="0" w:line="285" w:lineRule="atLeast"/>
+        <w:rPr>
+          <w:rFonts w:ascii="Consolas" w:eastAsia="Times New Roman" w:hAnsi="Consolas" w:cs="Times New Roman"/>
+          <w:color w:val="BBBEBF"/>
+          <w:kern w:val="0"/>
+          <w:sz w:val="21"/>
+          <w:szCs w:val="21"/>
+          <w14:ligatures w14:val="none"/>
+        </w:rPr>
+      </w:pPr>
+      <w:r>
+        <w:rPr>
+          <w:rFonts w:ascii="Consolas" w:eastAsia="Times New Roman" w:hAnsi="Consolas" w:cs="Times New Roman"/>
+          <w:color w:val="FFA657"/>
+          <w:kern w:val="0"/>
+          <w:sz w:val="21"/>
+          <w:szCs w:val="21"/>
+          <w14:ligatures w14:val="none"/>
+        </w:rPr>
+        <w:t>SPRING_DATASOURCE_PASSWORD</w:t>
+      </w:r>
+      <w:r>
+        <w:rPr>
+          <w:rFonts w:ascii="Consolas" w:eastAsia="Times New Roman" w:hAnsi="Consolas" w:cs="Times New Roman"/>
+          <w:color w:val="D4D4D4"/>
+          <w:kern w:val="0"/>
+          <w:sz w:val="21"/>
+          <w:szCs w:val="21"/>
+          <w14:ligatures w14:val="none"/>
+        </w:rPr>
+        <w:t>=</w:t>
+      </w:r>
+      <w:r>
+        <w:rPr>
+          <w:rFonts w:ascii="Consolas" w:eastAsia="Times New Roman" w:hAnsi="Consolas" w:cs="Times New Roman"/>
+          <w:color w:val="BBBEBF"/>
+          <w:kern w:val="0"/>
+          <w:sz w:val="21"/>
+          <w:szCs w:val="21"/>
+          <w14:ligatures w14:val="none"/>
+        </w:rPr>
+        <w:t>Duyluan5906</w:t>
+      </w:r>
+    </w:p>
+    <w:p>
+      <w:pPr>
+        <w:pStyle w:val="ListParagraph"/>
+        <w:numPr>
+          <w:ilvl w:val="0"/>
+          <w:numId w:val="8"/>
+        </w:numPr>
+        <w:shd w:val="clear" w:color="auto" w:fill="121314"/>
+        <w:spacing w:after="0" w:line="285" w:lineRule="atLeast"/>
+        <w:rPr>
+          <w:rFonts w:ascii="Consolas" w:eastAsia="Times New Roman" w:hAnsi="Consolas" w:cs="Times New Roman"/>
+          <w:color w:val="BBBEBF"/>
+          <w:kern w:val="0"/>
+          <w:sz w:val="21"/>
+          <w:szCs w:val="21"/>
+          <w14:ligatures w14:val="none"/>
+        </w:rPr>
+      </w:pPr>
+    </w:p>
+    <w:p>
+      <w:pPr>
+        <w:pStyle w:val="ListParagraph"/>
+        <w:numPr>
+          <w:ilvl w:val="0"/>
+          <w:numId w:val="8"/>
+        </w:numPr>
+        <w:shd w:val="clear" w:color="auto" w:fill="121314"/>
+        <w:spacing w:after="0" w:line="285" w:lineRule="atLeast"/>
+        <w:rPr>
+          <w:rFonts w:ascii="Consolas" w:eastAsia="Times New Roman" w:hAnsi="Consolas" w:cs="Times New Roman"/>
+          <w:color w:val="BBBEBF"/>
+          <w:kern w:val="0"/>
+          <w:sz w:val="21"/>
+          <w:szCs w:val="21"/>
+          <w14:ligatures w14:val="none"/>
+        </w:rPr>
+      </w:pPr>
+      <w:r>
+        <w:rPr>
+          <w:rFonts w:ascii="Consolas" w:eastAsia="Times New Roman" w:hAnsi="Consolas" w:cs="Times New Roman"/>
+          <w:color w:val="8B949E"/>
+          <w:kern w:val="0"/>
+          <w:sz w:val="21"/>
+          <w:szCs w:val="21"/>
+          <w14:ligatures w14:val="none"/>
+        </w:rPr>
+        <w:t># 2. Cloudinary Configuration</w:t>
+      </w:r>
+    </w:p>
+    <w:p>
+      <w:pPr>
+        <w:pStyle w:val="ListParagraph"/>
+        <w:numPr>
+          <w:ilvl w:val="0"/>
+          <w:numId w:val="8"/>
+        </w:numPr>
+        <w:shd w:val="clear" w:color="auto" w:fill="121314"/>
+        <w:spacing w:after="0" w:line="285" w:lineRule="atLeast"/>
+        <w:rPr>
+          <w:rFonts w:ascii="Consolas" w:eastAsia="Times New Roman" w:hAnsi="Consolas" w:cs="Times New Roman"/>
+          <w:color w:val="BBBEBF"/>
+          <w:kern w:val="0"/>
+          <w:sz w:val="21"/>
+          <w:szCs w:val="21"/>
+          <w14:ligatures w14:val="none"/>
+        </w:rPr>
+      </w:pPr>
+      <w:r>
+        <w:rPr>
+          <w:rFonts w:ascii="Consolas" w:eastAsia="Times New Roman" w:hAnsi="Consolas" w:cs="Times New Roman"/>
+          <w:color w:val="FFA657"/>
+          <w:kern w:val="0"/>
+          <w:sz w:val="21"/>
+          <w:szCs w:val="21"/>
+          <w14:ligatures w14:val="none"/>
+        </w:rPr>
+        <w:t>CLOUDINARY_CLOUD_NAME</w:t>
+      </w:r>
+      <w:r>
+        <w:rPr>
+          <w:rFonts w:ascii="Consolas" w:eastAsia="Times New Roman" w:hAnsi="Consolas" w:cs="Times New Roman"/>
+          <w:color w:val="D4D4D4"/>
+          <w:kern w:val="0"/>
+          <w:sz w:val="21"/>
+          <w:szCs w:val="21"/>
+          <w14:ligatures w14:val="none"/>
+        </w:rPr>
+        <w:t>=</w:t>
+      </w:r>
+      <w:r>
+        <w:rPr>
+          <w:rFonts w:ascii="Consolas" w:eastAsia="Times New Roman" w:hAnsi="Consolas" w:cs="Times New Roman"/>
+          <w:color w:val="BBBEBF"/>
+          <w:kern w:val="0"/>
+          <w:sz w:val="21"/>
+          <w:szCs w:val="21"/>
+          <w14:ligatures w14:val="none"/>
+        </w:rPr>
+        <w:t>fyybh8wr</w:t>
+      </w:r>
+    </w:p>
+    <w:p>
+      <w:pPr>
+        <w:pStyle w:val="ListParagraph"/>
+        <w:numPr>
+          <w:ilvl w:val="0"/>
+          <w:numId w:val="8"/>
+        </w:numPr>
+        <w:shd w:val="clear" w:color="auto" w:fill="121314"/>
+        <w:spacing w:after="0" w:line="285" w:lineRule="atLeast"/>
+        <w:rPr>
+          <w:rFonts w:ascii="Consolas" w:eastAsia="Times New Roman" w:hAnsi="Consolas" w:cs="Times New Roman"/>
+          <w:color w:val="BBBEBF"/>
+          <w:kern w:val="0"/>
+          <w:sz w:val="21"/>
+          <w:szCs w:val="21"/>
+          <w14:ligatures w14:val="none"/>
+        </w:rPr>
+      </w:pPr>
+      <w:r>
+        <w:rPr>
+          <w:rFonts w:ascii="Consolas" w:eastAsia="Times New Roman" w:hAnsi="Consolas" w:cs="Times New Roman"/>
+          <w:color w:val="FFA657"/>
+          <w:kern w:val="0"/>
+          <w:sz w:val="21"/>
+          <w:szCs w:val="21"/>
+          <w14:ligatures w14:val="none"/>
+        </w:rPr>
+        <w:t>CLOUDINARY_API_KEY</w:t>
+      </w:r>
+      <w:r>
+        <w:rPr>
+          <w:rFonts w:ascii="Consolas" w:eastAsia="Times New Roman" w:hAnsi="Consolas" w:cs="Times New Roman"/>
+          <w:color w:val="D4D4D4"/>
+          <w:kern w:val="0"/>
+          <w:sz w:val="21"/>
+          <w:szCs w:val="21"/>
+          <w14:ligatures w14:val="none"/>
+        </w:rPr>
+        <w:t>=</w:t>
+      </w:r>
+      <w:r>
+        <w:rPr>
+          <w:rFonts w:ascii="Consolas" w:eastAsia="Times New Roman" w:hAnsi="Consolas" w:cs="Times New Roman"/>
+          <w:color w:val="BBBEBF"/>
+          <w:kern w:val="0"/>
+          <w:sz w:val="21"/>
+          <w:szCs w:val="21"/>
+          <w14:ligatures w14:val="none"/>
+        </w:rPr>
+        <w:t>754815673414692</w:t>
+      </w:r>
+    </w:p>
+    <w:p>
+      <w:pPr>
+        <w:pStyle w:val="ListParagraph"/>
+        <w:numPr>
+          <w:ilvl w:val="0"/>
+          <w:numId w:val="8"/>
+        </w:numPr>
+        <w:shd w:val="clear" w:color="auto" w:fill="121314"/>
+        <w:spacing w:after="0" w:line="285" w:lineRule="atLeast"/>
+        <w:rPr>
+          <w:rFonts w:ascii="Consolas" w:eastAsia="Times New Roman" w:hAnsi="Consolas" w:cs="Times New Roman"/>
+          <w:color w:val="BBBEBF"/>
+          <w:kern w:val="0"/>
+          <w:sz w:val="21"/>
+          <w:szCs w:val="21"/>
+          <w14:ligatures w14:val="none"/>
+        </w:rPr>
+      </w:pPr>
+      <w:r>
+        <w:rPr>
+          <w:rFonts w:ascii="Consolas" w:eastAsia="Times New Roman" w:hAnsi="Consolas" w:cs="Times New Roman"/>
+          <w:color w:val="FFA657"/>
+          <w:kern w:val="0"/>
+          <w:sz w:val="21"/>
+          <w:szCs w:val="21"/>
+          <w14:ligatures w14:val="none"/>
+        </w:rPr>
+        <w:t>CLOUDINARY_API_SECRET</w:t>
+      </w:r>
+      <w:r>
+        <w:rPr>
+          <w:rFonts w:ascii="Consolas" w:eastAsia="Times New Roman" w:hAnsi="Consolas" w:cs="Times New Roman"/>
+          <w:color w:val="D4D4D4"/>
+          <w:kern w:val="0"/>
+          <w:sz w:val="21"/>
+          <w:szCs w:val="21"/>
+          <w14:ligatures w14:val="none"/>
+        </w:rPr>
+        <w:t>=</w:t>
+      </w:r>
+      <w:r>
+        <w:rPr>
+          <w:rFonts w:ascii="Consolas" w:eastAsia="Times New Roman" w:hAnsi="Consolas" w:cs="Times New Roman"/>
+          <w:color w:val="BBBEBF"/>
+          <w:kern w:val="0"/>
+          <w:sz w:val="21"/>
+          <w:szCs w:val="21"/>
+          <w14:ligatures w14:val="none"/>
+        </w:rPr>
+        <w:t>_UpA5eM2ICDZE3aouxAcCRqTs6A</w:t>
+      </w:r>
+    </w:p>
+    <w:p>
+      <w:pPr>
+        <w:pStyle w:val="ListParagraph"/>
+        <w:numPr>
+          <w:ilvl w:val="0"/>
+          <w:numId w:val="8"/>
+        </w:numPr>
+        <w:shd w:val="clear" w:color="auto" w:fill="121314"/>
+        <w:spacing w:after="0" w:line="285" w:lineRule="atLeast"/>
+        <w:rPr>
+          <w:rFonts w:ascii="Consolas" w:eastAsia="Times New Roman" w:hAnsi="Consolas" w:cs="Times New Roman"/>
+          <w:color w:val="BBBEBF"/>
+          <w:kern w:val="0"/>
+          <w:sz w:val="21"/>
+          <w:szCs w:val="21"/>
+          <w14:ligatures w14:val="none"/>
+        </w:rPr>
+      </w:pPr>
+    </w:p>
+    <w:p>
+      <w:pPr>
+        <w:pStyle w:val="ListParagraph"/>
+        <w:numPr>
+          <w:ilvl w:val="0"/>
+          <w:numId w:val="8"/>
+        </w:numPr>
+        <w:shd w:val="clear" w:color="auto" w:fill="121314"/>
+        <w:spacing w:after="0" w:line="285" w:lineRule="atLeast"/>
+        <w:rPr>
+          <w:rFonts w:ascii="Consolas" w:eastAsia="Times New Roman" w:hAnsi="Consolas" w:cs="Times New Roman"/>
+          <w:color w:val="BBBEBF"/>
+          <w:kern w:val="0"/>
+          <w:sz w:val="21"/>
+          <w:szCs w:val="21"/>
+          <w14:ligatures w14:val="none"/>
+        </w:rPr>
+      </w:pPr>
+      <w:r>
+        <w:rPr>
+          <w:rFonts w:ascii="Consolas" w:eastAsia="Times New Roman" w:hAnsi="Consolas" w:cs="Times New Roman"/>
+          <w:color w:val="8B949E"/>
+          <w:kern w:val="0"/>
+          <w:sz w:val="21"/>
+          <w:szCs w:val="21"/>
+          <w14:ligatures w14:val="none"/>
+        </w:rPr>
+        <w:t># 3. JWT Security Configuration (Đã xóa ngoặc kép ")</w:t>
+      </w:r>
+    </w:p>
+    <w:p>
+      <w:pPr>
+        <w:pStyle w:val="ListParagraph"/>
+        <w:numPr>
+          <w:ilvl w:val="0"/>
+          <w:numId w:val="8"/>
+        </w:numPr>
+        <w:shd w:val="clear" w:color="auto" w:fill="121314"/>
+        <w:spacing w:after="0" w:line="285" w:lineRule="atLeast"/>
+        <w:rPr>
+          <w:rFonts w:ascii="Consolas" w:eastAsia="Times New Roman" w:hAnsi="Consolas" w:cs="Times New Roman"/>
+          <w:color w:val="BBBEBF"/>
+          <w:kern w:val="0"/>
+          <w:sz w:val="21"/>
+          <w:szCs w:val="21"/>
+          <w14:ligatures w14:val="none"/>
+        </w:rPr>
+      </w:pPr>
+      <w:r>
+        <w:rPr>
+          <w:rFonts w:ascii="Consolas" w:eastAsia="Times New Roman" w:hAnsi="Consolas" w:cs="Times New Roman"/>
+          <w:color w:val="FFA657"/>
+          <w:kern w:val="0"/>
+          <w:sz w:val="21"/>
+          <w:szCs w:val="21"/>
+          <w14:ligatures w14:val="none"/>
+        </w:rPr>
+        <w:t>JWT_SECRET</w:t>
+      </w:r>
+      <w:r>
+        <w:rPr>
+          <w:rFonts w:ascii="Consolas" w:eastAsia="Times New Roman" w:hAnsi="Consolas" w:cs="Times New Roman"/>
+          <w:color w:val="D4D4D4"/>
+          <w:kern w:val="0"/>
+          <w:sz w:val="21"/>
+          <w:szCs w:val="21"/>
+          <w14:ligatures w14:val="none"/>
+        </w:rPr>
+        <w:t>=</w:t>
+      </w:r>
+      <w:r>
+        <w:rPr>
+          <w:rFonts w:ascii="Consolas" w:eastAsia="Times New Roman" w:hAnsi="Consolas" w:cs="Times New Roman"/>
+          <w:color w:val="BBBEBF"/>
+          <w:kern w:val="0"/>
+          <w:sz w:val="21"/>
+          <w:szCs w:val="21"/>
+          <w14:ligatures w14:val="none"/>
+        </w:rPr>
+        <w:t>4MA4uk/7X6cj3d7DsvMovfaa4xMOwaiJiUmM0u42Vjk=</w:t>
+      </w:r>
+    </w:p>
+    <w:p>
+      <w:pPr>
+        <w:pStyle w:val="ListParagraph"/>
+        <w:numPr>
+          <w:ilvl w:val="0"/>
+          <w:numId w:val="8"/>
+        </w:numPr>
+        <w:shd w:val="clear" w:color="auto" w:fill="121314"/>
+        <w:spacing w:after="0" w:line="285" w:lineRule="atLeast"/>
+        <w:rPr>
+          <w:rFonts w:ascii="Consolas" w:eastAsia="Times New Roman" w:hAnsi="Consolas" w:cs="Times New Roman"/>
+          <w:color w:val="BBBEBF"/>
+          <w:kern w:val="0"/>
+          <w:sz w:val="21"/>
+          <w:szCs w:val="21"/>
+          <w14:ligatures w14:val="none"/>
+        </w:rPr>
+      </w:pPr>
+      <w:r>
+        <w:rPr>
+          <w:rFonts w:ascii="Consolas" w:eastAsia="Times New Roman" w:hAnsi="Consolas" w:cs="Times New Roman"/>
+          <w:color w:val="FFA657"/>
+          <w:kern w:val="0"/>
+          <w:sz w:val="21"/>
+          <w:szCs w:val="21"/>
+          <w14:ligatures w14:val="none"/>
+        </w:rPr>
+        <w:t>JWT_EXPIRATION_MS</w:t>
+      </w:r>
+      <w:r>
+        <w:rPr>
+          <w:rFonts w:ascii="Consolas" w:eastAsia="Times New Roman" w:hAnsi="Consolas" w:cs="Times New Roman"/>
+          <w:color w:val="D4D4D4"/>
+          <w:kern w:val="0"/>
+          <w:sz w:val="21"/>
+          <w:szCs w:val="21"/>
+          <w14:ligatures w14:val="none"/>
+        </w:rPr>
+        <w:t>=</w:t>
+      </w:r>
+      <w:r>
+        <w:rPr>
+          <w:rFonts w:ascii="Consolas" w:eastAsia="Times New Roman" w:hAnsi="Consolas" w:cs="Times New Roman"/>
+          <w:color w:val="BBBEBF"/>
+          <w:kern w:val="0"/>
+          <w:sz w:val="21"/>
+          <w:szCs w:val="21"/>
+          <w14:ligatures w14:val="none"/>
+        </w:rPr>
+        <w:t>86400000</w:t>
+      </w:r>
+    </w:p>
+    <w:p>
+      <w:pPr>
+        <w:pStyle w:val="ListParagraph"/>
+        <w:numPr>
+          <w:ilvl w:val="0"/>
+          <w:numId w:val="8"/>
+        </w:numPr>
+        <w:shd w:val="clear" w:color="auto" w:fill="121314"/>
+        <w:spacing w:after="0" w:line="285" w:lineRule="atLeast"/>
+        <w:rPr>
+          <w:rFonts w:ascii="Consolas" w:eastAsia="Times New Roman" w:hAnsi="Consolas" w:cs="Times New Roman"/>
+          <w:color w:val="BBBEBF"/>
+          <w:kern w:val="0"/>
+          <w:sz w:val="21"/>
+          <w:szCs w:val="21"/>
+          <w14:ligatures w14:val="none"/>
+        </w:rPr>
+      </w:pPr>
+      <w:r>
+        <w:rPr>
+          <w:rFonts w:ascii="Consolas" w:eastAsia="Times New Roman" w:hAnsi="Consolas" w:cs="Times New Roman"/>
+          <w:color w:val="FFA657"/>
+          <w:kern w:val="0"/>
+          <w:sz w:val="21"/>
+          <w:szCs w:val="21"/>
+          <w14:ligatures w14:val="none"/>
+        </w:rPr>
+        <w:t>JWT_VALIDITY_MINUTES</w:t>
+      </w:r>
+      <w:r>
+        <w:rPr>
+          <w:rFonts w:ascii="Consolas" w:eastAsia="Times New Roman" w:hAnsi="Consolas" w:cs="Times New Roman"/>
+          <w:color w:val="D4D4D4"/>
+          <w:kern w:val="0"/>
+          <w:sz w:val="21"/>
+          <w:szCs w:val="21"/>
+          <w14:ligatures w14:val="none"/>
+        </w:rPr>
+        <w:t>=</w:t>
+      </w:r>
+      <w:r>
+        <w:rPr>
+          <w:rFonts w:ascii="Consolas" w:eastAsia="Times New Roman" w:hAnsi="Consolas" w:cs="Times New Roman"/>
+          <w:color w:val="BBBEBF"/>
+          <w:kern w:val="0"/>
+          <w:sz w:val="21"/>
+          <w:szCs w:val="21"/>
+          <w14:ligatures w14:val="none"/>
+        </w:rPr>
+        <w:t>20</w:t>
+      </w:r>
+    </w:p>
+    <w:p>
+      <w:pPr>
+        <w:pStyle w:val="ListParagraph"/>
+        <w:numPr>
+          <w:ilvl w:val="0"/>
+          <w:numId w:val="8"/>
+        </w:numPr>
+        <w:shd w:val="clear" w:color="auto" w:fill="121314"/>
+        <w:spacing w:after="0" w:line="285" w:lineRule="atLeast"/>
+        <w:rPr>
+          <w:rFonts w:ascii="Consolas" w:eastAsia="Times New Roman" w:hAnsi="Consolas" w:cs="Times New Roman"/>
+          <w:color w:val="BBBEBF"/>
+          <w:kern w:val="0"/>
+          <w:sz w:val="21"/>
+          <w:szCs w:val="21"/>
+          <w14:ligatures w14:val="none"/>
+        </w:rPr>
+      </w:pPr>
+    </w:p>
+    <w:p>
+      <w:pPr>
+        <w:pStyle w:val="ListParagraph"/>
+        <w:numPr>
+          <w:ilvl w:val="0"/>
+          <w:numId w:val="8"/>
+        </w:numPr>
+        <w:shd w:val="clear" w:color="auto" w:fill="121314"/>
+        <w:spacing w:after="0" w:line="285" w:lineRule="atLeast"/>
+        <w:rPr>
+          <w:rFonts w:ascii="Consolas" w:eastAsia="Times New Roman" w:hAnsi="Consolas" w:cs="Times New Roman"/>
+          <w:color w:val="BBBEBF"/>
+          <w:kern w:val="0"/>
+          <w:sz w:val="21"/>
+          <w:szCs w:val="21"/>
+          <w14:ligatures w14:val="none"/>
+        </w:rPr>
+      </w:pPr>
+      <w:r>
+        <w:rPr>
+          <w:rFonts w:ascii="Consolas" w:eastAsia="Times New Roman" w:hAnsi="Consolas" w:cs="Times New Roman"/>
+          <w:color w:val="8B949E"/>
+          <w:kern w:val="0"/>
+          <w:sz w:val="21"/>
+          <w:szCs w:val="21"/>
+          <w14:ligatures w14:val="none"/>
+        </w:rPr>
+        <w:t># 4. Mail Configuration</w:t>
+      </w:r>
+    </w:p>
+    <w:p>
+      <w:pPr>
+        <w:pStyle w:val="ListParagraph"/>
+        <w:numPr>
+          <w:ilvl w:val="0"/>
+          <w:numId w:val="8"/>
+        </w:numPr>
+        <w:shd w:val="clear" w:color="auto" w:fill="121314"/>
+        <w:spacing w:after="0" w:line="285" w:lineRule="atLeast"/>
+        <w:rPr>
+          <w:rFonts w:ascii="Consolas" w:eastAsia="Times New Roman" w:hAnsi="Consolas" w:cs="Times New Roman"/>
+          <w:color w:val="BBBEBF"/>
+          <w:kern w:val="0"/>
+          <w:sz w:val="21"/>
+          <w:szCs w:val="21"/>
+          <w14:ligatures w14:val="none"/>
+        </w:rPr>
+      </w:pPr>
+      <w:r>
+        <w:rPr>
+          <w:rFonts w:ascii="Consolas" w:eastAsia="Times New Roman" w:hAnsi="Consolas" w:cs="Times New Roman"/>
+          <w:color w:val="FFA657"/>
+          <w:kern w:val="0"/>
+          <w:sz w:val="21"/>
+          <w:szCs w:val="21"/>
+          <w14:ligatures w14:val="none"/>
+        </w:rPr>
+        <w:t>MAIL_HOST</w:t>
+      </w:r>
+      <w:r>
+        <w:rPr>
+          <w:rFonts w:ascii="Consolas" w:eastAsia="Times New Roman" w:hAnsi="Consolas" w:cs="Times New Roman"/>
+          <w:color w:val="D4D4D4"/>
+          <w:kern w:val="0"/>
+          <w:sz w:val="21"/>
+          <w:szCs w:val="21"/>
+          <w14:ligatures w14:val="none"/>
+        </w:rPr>
+        <w:t>=</w:t>
+      </w:r>
+      <w:r>
+        <w:rPr>
+          <w:rFonts w:ascii="Consolas" w:eastAsia="Times New Roman" w:hAnsi="Consolas" w:cs="Times New Roman"/>
+          <w:color w:val="BBBEBF"/>
+          <w:kern w:val="0"/>
+          <w:sz w:val="21"/>
+          <w:szCs w:val="21"/>
+          <w14:ligatures w14:val="none"/>
+        </w:rPr>
+        <w:t>smtp.gmail.com</w:t>
+      </w:r>
+    </w:p>
+    <w:p>
+      <w:pPr>
+        <w:pStyle w:val="ListParagraph"/>
+        <w:numPr>
+          <w:ilvl w:val="0"/>
+          <w:numId w:val="8"/>
+        </w:numPr>
+        <w:shd w:val="clear" w:color="auto" w:fill="121314"/>
+        <w:spacing w:after="0" w:line="285" w:lineRule="atLeast"/>
+        <w:rPr>
+          <w:rFonts w:ascii="Consolas" w:eastAsia="Times New Roman" w:hAnsi="Consolas" w:cs="Times New Roman"/>
+          <w:color w:val="BBBEBF"/>
+          <w:kern w:val="0"/>
+          <w:sz w:val="21"/>
+          <w:szCs w:val="21"/>
+          <w14:ligatures w14:val="none"/>
+        </w:rPr>
+      </w:pPr>
+      <w:r>
+        <w:rPr>
+          <w:rFonts w:ascii="Consolas" w:eastAsia="Times New Roman" w:hAnsi="Consolas" w:cs="Times New Roman"/>
+          <w:color w:val="FFA657"/>
+          <w:kern w:val="0"/>
+          <w:sz w:val="21"/>
+          <w:szCs w:val="21"/>
+          <w14:ligatures w14:val="none"/>
+        </w:rPr>
+        <w:t>MAIL_PORT</w:t>
+      </w:r>
+      <w:r>
+        <w:rPr>
+          <w:rFonts w:ascii="Consolas" w:eastAsia="Times New Roman" w:hAnsi="Consolas" w:cs="Times New Roman"/>
+          <w:color w:val="D4D4D4"/>
+          <w:kern w:val="0"/>
+          <w:sz w:val="21"/>
+          <w:szCs w:val="21"/>
+          <w14:ligatures w14:val="none"/>
+        </w:rPr>
+        <w:t>=</w:t>
+      </w:r>
+      <w:r>
+        <w:rPr>
+          <w:rFonts w:ascii="Consolas" w:eastAsia="Times New Roman" w:hAnsi="Consolas" w:cs="Times New Roman"/>
+          <w:color w:val="BBBEBF"/>
+          <w:kern w:val="0"/>
+          <w:sz w:val="21"/>
+          <w:szCs w:val="21"/>
+          <w14:ligatures w14:val="none"/>
+        </w:rPr>
+        <w:t>587</w:t>
+      </w:r>
+    </w:p>
+    <w:p>
+      <w:pPr>
+        <w:pStyle w:val="ListParagraph"/>
+        <w:numPr>
+          <w:ilvl w:val="0"/>
+          <w:numId w:val="8"/>
+        </w:numPr>
+        <w:shd w:val="clear" w:color="auto" w:fill="121314"/>
+        <w:spacing w:after="0" w:line="285" w:lineRule="atLeast"/>
+        <w:rPr>
+          <w:rFonts w:ascii="Consolas" w:eastAsia="Times New Roman" w:hAnsi="Consolas" w:cs="Times New Roman"/>
+          <w:color w:val="BBBEBF"/>
+          <w:kern w:val="0"/>
+          <w:sz w:val="21"/>
+          <w:szCs w:val="21"/>
+          <w14:ligatures w14:val="none"/>
+        </w:rPr>
+      </w:pPr>
+      <w:r>
+        <w:rPr>
+          <w:rFonts w:ascii="Consolas" w:eastAsia="Times New Roman" w:hAnsi="Consolas" w:cs="Times New Roman"/>
+          <w:color w:val="FFA657"/>
+          <w:kern w:val="0"/>
+          <w:sz w:val="21"/>
+          <w:szCs w:val="21"/>
+          <w14:ligatures w14:val="none"/>
+        </w:rPr>
+        <w:t>MAIL_USERNAME</w:t>
+      </w:r>
+      <w:r>
+        <w:rPr>
+          <w:rFonts w:ascii="Consolas" w:eastAsia="Times New Roman" w:hAnsi="Consolas" w:cs="Times New Roman"/>
+          <w:color w:val="D4D4D4"/>
+          <w:kern w:val="0"/>
+          <w:sz w:val="21"/>
+          <w:szCs w:val="21"/>
+          <w14:ligatures w14:val="none"/>
+        </w:rPr>
+        <w:t>=</w:t>
+      </w:r>
+      <w:r>
+        <w:rPr>
+          <w:rFonts w:ascii="Consolas" w:eastAsia="Times New Roman" w:hAnsi="Consolas" w:cs="Times New Roman"/>
+          <w:color w:val="BBBEBF"/>
+          <w:kern w:val="0"/>
+          <w:sz w:val="21"/>
+          <w:szCs w:val="21"/>
+          <w14:ligatures w14:val="none"/>
+        </w:rPr>
+        <w:t>duyluan5906@gmail.com</w:t>
+      </w:r>
+    </w:p>
+    <w:p>
+      <w:pPr>
+        <w:pStyle w:val="ListParagraph"/>
+        <w:numPr>
+          <w:ilvl w:val="0"/>
+          <w:numId w:val="8"/>
+        </w:numPr>
+        <w:shd w:val="clear" w:color="auto" w:fill="121314"/>
+        <w:spacing w:after="0" w:line="285" w:lineRule="atLeast"/>
+        <w:rPr>
+          <w:rFonts w:ascii="Consolas" w:eastAsia="Times New Roman" w:hAnsi="Consolas" w:cs="Times New Roman"/>
+          <w:color w:val="BBBEBF"/>
+          <w:kern w:val="0"/>
+          <w:sz w:val="21"/>
+          <w:szCs w:val="21"/>
+          <w14:ligatures w14:val="none"/>
+        </w:rPr>
+      </w:pPr>
+      <w:r>
+        <w:rPr>
+          <w:rFonts w:ascii="Consolas" w:eastAsia="Times New Roman" w:hAnsi="Consolas" w:cs="Times New Roman"/>
+          <w:color w:val="FFA657"/>
+          <w:kern w:val="0"/>
+          <w:sz w:val="21"/>
+          <w:szCs w:val="21"/>
+          <w14:ligatures w14:val="none"/>
+        </w:rPr>
+        <w:t>MAIL_PASSWORD</w:t>
+      </w:r>
+      <w:r>
+        <w:rPr>
+          <w:rFonts w:ascii="Consolas" w:eastAsia="Times New Roman" w:hAnsi="Consolas" w:cs="Times New Roman"/>
+          <w:color w:val="D4D4D4"/>
+          <w:kern w:val="0"/>
+          <w:sz w:val="21"/>
+          <w:szCs w:val="21"/>
+          <w14:ligatures w14:val="none"/>
+        </w:rPr>
+        <w:t>=</w:t>
+      </w:r>
+      <w:r>
+        <w:rPr>
+          <w:rFonts w:ascii="Consolas" w:eastAsia="Times New Roman" w:hAnsi="Consolas" w:cs="Times New Roman"/>
+          <w:color w:val="BBBEBF"/>
+          <w:kern w:val="0"/>
+          <w:sz w:val="21"/>
+          <w:szCs w:val="21"/>
+          <w14:ligatures w14:val="none"/>
+        </w:rPr>
+        <w:t>roizorddevtpojgg</w:t>
+      </w:r>
+    </w:p>
+    <w:p>
+      <w:pPr>
+        <w:pStyle w:val="ListParagraph"/>
+        <w:numPr>
+          <w:ilvl w:val="0"/>
+          <w:numId w:val="8"/>
+        </w:numPr>
+        <w:shd w:val="clear" w:color="auto" w:fill="121314"/>
+        <w:spacing w:after="0" w:line="285" w:lineRule="atLeast"/>
+        <w:rPr>
+          <w:rFonts w:ascii="Consolas" w:eastAsia="Times New Roman" w:hAnsi="Consolas" w:cs="Times New Roman"/>
+          <w:color w:val="BBBEBF"/>
+          <w:kern w:val="0"/>
+          <w:sz w:val="21"/>
+          <w:szCs w:val="21"/>
+          <w14:ligatures w14:val="none"/>
+        </w:rPr>
+      </w:pPr>
+      <w:r>
+        <w:rPr>
+          <w:rFonts w:ascii="Consolas" w:eastAsia="Times New Roman" w:hAnsi="Consolas" w:cs="Times New Roman"/>
+          <w:color w:val="FFA657"/>
+          <w:kern w:val="0"/>
+          <w:sz w:val="21"/>
+          <w:szCs w:val="21"/>
+          <w14:ligatures w14:val="none"/>
+        </w:rPr>
+        <w:t>MAIL_FROM</w:t>
+      </w:r>
+      <w:r>
+        <w:rPr>
+          <w:rFonts w:ascii="Consolas" w:eastAsia="Times New Roman" w:hAnsi="Consolas" w:cs="Times New Roman"/>
+          <w:color w:val="D4D4D4"/>
+          <w:kern w:val="0"/>
+          <w:sz w:val="21"/>
+          <w:szCs w:val="21"/>
+          <w14:ligatures w14:val="none"/>
+        </w:rPr>
+        <w:t>=</w:t>
+      </w:r>
+      <w:r>
+        <w:rPr>
+          <w:rFonts w:ascii="Consolas" w:eastAsia="Times New Roman" w:hAnsi="Consolas" w:cs="Times New Roman"/>
+          <w:color w:val="BBBEBF"/>
+          <w:kern w:val="0"/>
+          <w:sz w:val="21"/>
+          <w:szCs w:val="21"/>
+          <w14:ligatures w14:val="none"/>
+        </w:rPr>
+        <w:t>duyluan5906@gmail.com</w:t>
+      </w:r>
+    </w:p>
+    <w:p>
+      <w:pPr>
+        <w:pStyle w:val="ListParagraph"/>
+        <w:numPr>
+          <w:ilvl w:val="0"/>
+          <w:numId w:val="8"/>
+        </w:numPr>
+        <w:shd w:val="clear" w:color="auto" w:fill="121314"/>
+        <w:spacing w:after="0" w:line="285" w:lineRule="atLeast"/>
+        <w:rPr>
+          <w:rFonts w:ascii="Consolas" w:eastAsia="Times New Roman" w:hAnsi="Consolas" w:cs="Times New Roman"/>
+          <w:color w:val="BBBEBF"/>
+          <w:kern w:val="0"/>
+          <w:sz w:val="21"/>
+          <w:szCs w:val="21"/>
+          <w14:ligatures w14:val="none"/>
+        </w:rPr>
+      </w:pPr>
+      <w:r>
+        <w:rPr>
+          <w:rFonts w:ascii="Consolas" w:eastAsia="Times New Roman" w:hAnsi="Consolas" w:cs="Times New Roman"/>
+          <w:color w:val="FFA657"/>
+          <w:kern w:val="0"/>
+          <w:sz w:val="21"/>
+          <w:szCs w:val="21"/>
+          <w14:ligatures w14:val="none"/>
+        </w:rPr>
+        <w:t>MAIL_SMTP_AUTH</w:t>
+      </w:r>
+      <w:r>
+        <w:rPr>
+          <w:rFonts w:ascii="Consolas" w:eastAsia="Times New Roman" w:hAnsi="Consolas" w:cs="Times New Roman"/>
+          <w:color w:val="D4D4D4"/>
+          <w:kern w:val="0"/>
+          <w:sz w:val="21"/>
+          <w:szCs w:val="21"/>
+          <w14:ligatures w14:val="none"/>
+        </w:rPr>
+        <w:t>=</w:t>
+      </w:r>
+      <w:r>
+        <w:rPr>
+          <w:rFonts w:ascii="Consolas" w:eastAsia="Times New Roman" w:hAnsi="Consolas" w:cs="Times New Roman"/>
+          <w:color w:val="BBBEBF"/>
+          <w:kern w:val="0"/>
+          <w:sz w:val="21"/>
+          <w:szCs w:val="21"/>
+          <w14:ligatures w14:val="none"/>
+        </w:rPr>
+        <w:t>true</w:t>
+      </w:r>
+    </w:p>
+    <w:p>
+      <w:pPr>
+        <w:pStyle w:val="ListParagraph"/>
+        <w:numPr>
+          <w:ilvl w:val="0"/>
+          <w:numId w:val="8"/>
+        </w:numPr>
+        <w:shd w:val="clear" w:color="auto" w:fill="121314"/>
+        <w:spacing w:after="0" w:line="285" w:lineRule="atLeast"/>
+        <w:rPr>
+          <w:rFonts w:ascii="Consolas" w:eastAsia="Times New Roman" w:hAnsi="Consolas" w:cs="Times New Roman"/>
+          <w:color w:val="BBBEBF"/>
+          <w:kern w:val="0"/>
+          <w:sz w:val="21"/>
+          <w:szCs w:val="21"/>
+          <w14:ligatures w14:val="none"/>
+        </w:rPr>
+      </w:pPr>
+      <w:r>
+        <w:rPr>
+          <w:rFonts w:ascii="Consolas" w:eastAsia="Times New Roman" w:hAnsi="Consolas" w:cs="Times New Roman"/>
+          <w:color w:val="FFA657"/>
+          <w:kern w:val="0"/>
+          <w:sz w:val="21"/>
+          <w:szCs w:val="21"/>
+          <w14:ligatures w14:val="none"/>
+        </w:rPr>
+        <w:t>MAIL_STARTTLS</w:t>
+      </w:r>
+      <w:r>
+        <w:rPr>
+          <w:rFonts w:ascii="Consolas" w:eastAsia="Times New Roman" w:hAnsi="Consolas" w:cs="Times New Roman"/>
+          <w:color w:val="D4D4D4"/>
+          <w:kern w:val="0"/>
+          <w:sz w:val="21"/>
+          <w:szCs w:val="21"/>
+          <w14:ligatures w14:val="none"/>
+        </w:rPr>
+        <w:t>=</w:t>
+      </w:r>
+      <w:r>
+        <w:rPr>
+          <w:rFonts w:ascii="Consolas" w:eastAsia="Times New Roman" w:hAnsi="Consolas" w:cs="Times New Roman"/>
+          <w:color w:val="BBBEBF"/>
+          <w:kern w:val="0"/>
+          <w:sz w:val="21"/>
+          <w:szCs w:val="21"/>
+          <w14:ligatures w14:val="none"/>
+        </w:rPr>
+        <w:t>true</w:t>
+      </w:r>
+    </w:p>
+    <w:p>
+      <w:pPr>
+        <w:pStyle w:val="ListParagraph"/>
+        <w:numPr>
+          <w:ilvl w:val="0"/>
+          <w:numId w:val="8"/>
+        </w:numPr>
+        <w:shd w:val="clear" w:color="auto" w:fill="121314"/>
+        <w:spacing w:after="0" w:line="285" w:lineRule="atLeast"/>
+        <w:rPr>
+          <w:rFonts w:ascii="Consolas" w:eastAsia="Times New Roman" w:hAnsi="Consolas" w:cs="Times New Roman"/>
+          <w:color w:val="BBBEBF"/>
+          <w:kern w:val="0"/>
+          <w:sz w:val="21"/>
+          <w:szCs w:val="21"/>
+          <w14:ligatures w14:val="none"/>
+        </w:rPr>
+      </w:pPr>
+    </w:p>
+    <w:p>
+      <w:pPr>
+        <w:pStyle w:val="ListParagraph"/>
+        <w:numPr>
+          <w:ilvl w:val="0"/>
+          <w:numId w:val="8"/>
+        </w:numPr>
+        <w:shd w:val="clear" w:color="auto" w:fill="121314"/>
+        <w:spacing w:after="0" w:line="285" w:lineRule="atLeast"/>
+        <w:rPr>
+          <w:rFonts w:ascii="Consolas" w:eastAsia="Times New Roman" w:hAnsi="Consolas" w:cs="Times New Roman"/>
+          <w:color w:val="BBBEBF"/>
+          <w:kern w:val="0"/>
+          <w:sz w:val="21"/>
+          <w:szCs w:val="21"/>
+          <w14:ligatures w14:val="none"/>
+        </w:rPr>
+      </w:pPr>
+      <w:r>
+        <w:rPr>
+          <w:rFonts w:ascii="Consolas" w:eastAsia="Times New Roman" w:hAnsi="Consolas" w:cs="Times New Roman"/>
+          <w:color w:val="8B949E"/>
+          <w:kern w:val="0"/>
+          <w:sz w:val="21"/>
+          <w:szCs w:val="21"/>
+          <w14:ligatures w14:val="none"/>
+        </w:rPr>
+        <w:t># 5. App &amp; Security Config</w:t>
+      </w:r>
+    </w:p>
+    <w:p>
+      <w:pPr>
+        <w:pStyle w:val="ListParagraph"/>
+        <w:numPr>
+          <w:ilvl w:val="0"/>
+          <w:numId w:val="8"/>
+        </w:numPr>
+        <w:shd w:val="clear" w:color="auto" w:fill="121314"/>
+        <w:spacing w:after="0" w:line="285" w:lineRule="atLeast"/>
+        <w:rPr>
+          <w:rFonts w:ascii="Consolas" w:eastAsia="Times New Roman" w:hAnsi="Consolas" w:cs="Times New Roman"/>
+          <w:color w:val="BBBEBF"/>
+          <w:kern w:val="0"/>
+          <w:sz w:val="21"/>
+          <w:szCs w:val="21"/>
+          <w14:ligatures w14:val="none"/>
+        </w:rPr>
+      </w:pPr>
+      <w:r>
+        <w:rPr>
+          <w:rFonts w:ascii="Consolas" w:eastAsia="Times New Roman" w:hAnsi="Consolas" w:cs="Times New Roman"/>
+          <w:color w:val="FFA657"/>
+          <w:kern w:val="0"/>
+          <w:sz w:val="21"/>
+          <w:szCs w:val="21"/>
+          <w14:ligatures w14:val="none"/>
+        </w:rPr>
+        <w:t>COOKIE_SECURE</w:t>
+      </w:r>
+      <w:r>
+        <w:rPr>
+          <w:rFonts w:ascii="Consolas" w:eastAsia="Times New Roman" w:hAnsi="Consolas" w:cs="Times New Roman"/>
+          <w:color w:val="D4D4D4"/>
+          <w:kern w:val="0"/>
+          <w:sz w:val="21"/>
+          <w:szCs w:val="21"/>
+          <w14:ligatures w14:val="none"/>
+        </w:rPr>
+        <w:t>=</w:t>
+      </w:r>
+      <w:r>
+        <w:rPr>
+          <w:rFonts w:ascii="Consolas" w:eastAsia="Times New Roman" w:hAnsi="Consolas" w:cs="Times New Roman"/>
+          <w:color w:val="BBBEBF"/>
+          <w:kern w:val="0"/>
+          <w:sz w:val="21"/>
+          <w:szCs w:val="21"/>
+          <w14:ligatures w14:val="none"/>
+        </w:rPr>
+        <w:t>false</w:t>
+      </w:r>
+    </w:p>
+    <w:p>
+      <w:pPr>
+        <w:pStyle w:val="ListParagraph"/>
+        <w:numPr>
+          <w:ilvl w:val="0"/>
+          <w:numId w:val="8"/>
+        </w:numPr>
+        <w:shd w:val="clear" w:color="auto" w:fill="121314"/>
+        <w:spacing w:after="0" w:line="285" w:lineRule="atLeast"/>
+        <w:rPr>
+          <w:rFonts w:ascii="Consolas" w:eastAsia="Times New Roman" w:hAnsi="Consolas" w:cs="Times New Roman"/>
+          <w:color w:val="BBBEBF"/>
+          <w:kern w:val="0"/>
+          <w:sz w:val="21"/>
+          <w:szCs w:val="21"/>
+          <w14:ligatures w14:val="none"/>
+        </w:rPr>
+      </w:pPr>
+      <w:r>
+        <w:rPr>
+          <w:rFonts w:ascii="Consolas" w:eastAsia="Times New Roman" w:hAnsi="Consolas" w:cs="Times New Roman"/>
+          <w:color w:val="FFA657"/>
+          <w:kern w:val="0"/>
+          <w:sz w:val="21"/>
+          <w:szCs w:val="21"/>
+          <w14:ligatures w14:val="none"/>
+        </w:rPr>
+        <w:t>APP_PUBLIC_BASE_URL</w:t>
+      </w:r>
+      <w:r>
+        <w:rPr>
+          <w:rFonts w:ascii="Consolas" w:eastAsia="Times New Roman" w:hAnsi="Consolas" w:cs="Times New Roman"/>
+          <w:color w:val="D4D4D4"/>
+          <w:kern w:val="0"/>
+          <w:sz w:val="21"/>
+          <w:szCs w:val="21"/>
+          <w14:ligatures w14:val="none"/>
+        </w:rPr>
+        <w:t>=</w:t>
+      </w:r>
+      <w:r>
+        <w:rPr>
+          <w:rFonts w:ascii="Consolas" w:eastAsia="Times New Roman" w:hAnsi="Consolas" w:cs="Times New Roman"/>
+          <w:color w:val="BBBEBF"/>
+          <w:kern w:val="0"/>
+          <w:sz w:val="21"/>
+          <w:szCs w:val="21"/>
+          <w14:ligatures w14:val="none"/>
+        </w:rPr>
+        <w:t>http://localhost:8080</w:t>
       </w:r>
     </w:p>
     <w:p/>
@@ -3193,6 +4502,7 @@
   <w:style w:type="character" w:default="1" w:styleId="DefaultParagraphFont">
     <w:name w:val="Default Paragraph Font"/>
     <w:uiPriority w:val="1"/>
+    <w:semiHidden/>
     <w:unhideWhenUsed/>
   </w:style>
   <w:style w:type="table" w:default="1" w:styleId="TableNormal">

</xml_diff>